<commit_message>
feat(converters): add detailed hardware schematics, connection netlists, and component BOMs across all 20 converter topologies
- Upgrade all 20 power converter technical dossiers across DC-DC non-isolated/isolated, AC-DC rectifiers/PFC, DC-AC inverters, and AC-AC controllers/cycloconverters
- Include explicit semiconductor terminal pinouts (D/G/S, C/G/E, A/K), gate drivers (bootstrap, isolated, pulse transformers), RC/RCD snubbers, and current transducers
- Add Component Connection Netlist & Terminal Details tables and Component BOM & Parametric Specifications tables with manufacturer part numbers and layout constraints
- Re-compile all Markdown files to Word (.docx) documents via tools/md_to_docx.py
- Add converters to default scan_dirs in tools/md_to_docx.py
</commit_message>
<xml_diff>
--- a/vvdn/converters/ac-ac/ac-voltage-controllers.docx
+++ b/vvdn/converters/ac-ac/ac-voltage-controllers.docx
@@ -112,23 +112,1743 @@
                 <w:color w:val="2D3748"/>
                 <w:sz w:val="18"/>
               </w:rPr>
-              <w:t xml:space="preserve">                     Single-Phase AC Voltage Controller</w:t>
+              <w:t>========================================================================================================================</w:t>
               <w:br/>
-              <w:t xml:space="preserve">                        T1 (Forward SCR)</w:t>
+              <w:t xml:space="preserve">     DETAILED HARDWARE SCHEMATIC: SINGLE-PHASE SOLID-STATE AC VOLTAGE CONTROLLER (230V AC RMS, 16A / 3.6kW)</w:t>
               <w:br/>
-              <w:t xml:space="preserve">             ┌───────────────[&gt;|]───────────────┐</w:t>
+              <w:t>========================================================================================================================</w:t>
               <w:br/>
-              <w:t xml:space="preserve">             │               gate1              │</w:t>
               <w:br/>
-              <w:t xml:space="preserve">   AC Line ──┴───┬──────────────────────────────┴───┬───[ Inductive / Resistive Load ]───&gt; AC Return</w:t>
+              <w:t xml:space="preserve">    AC LINE (230V RMS, 50Hz) ──[ F1: 20A Time-Lag ]──┬──────────────────────────────────────────────────┐</w:t>
               <w:br/>
-              <w:t xml:space="preserve">                 │               gate2              │       (Z_L = R + jwL)</w:t>
+              <w:t xml:space="preserve">                                                     │                                                  │</w:t>
               <w:br/>
-              <w:t xml:space="preserve">                 └───────────────[|&lt;]───────────────┘</w:t>
+              <w:t xml:space="preserve">                                                    ┌┴┐ MOV1: 275V RMS                                  │</w:t>
               <w:br/>
-              <w:t xml:space="preserve">                                T2 (Reverse SCR)</w:t>
+              <w:t xml:space="preserve">                                                    │ │ Littelfuse V275LA20CP                           │</w:t>
               <w:br/>
-              <w:t xml:space="preserve">                                (Anti-Parallel)</w:t>
+              <w:t xml:space="preserve">                                                    └┬┘ (Clamps Spikes &gt; 4.5kA)                         │</w:t>
+              <w:br/>
+              <w:t xml:space="preserve">                                                     │                                                  │</w:t>
+              <w:br/>
+              <w:t xml:space="preserve">    AC NEUTRAL (Return) ─────────────────────────────┼────────────────────────────────────────────+     │</w:t>
+              <w:br/>
+              <w:t xml:space="preserve">                                                     │                                            │     │</w:t>
+              <w:br/>
+              <w:t xml:space="preserve">                                                     │        +---[ OPTO-TRIAC GATE DRIVER ]---+  │     │</w:t>
+              <w:br/>
+              <w:t xml:space="preserve">                                                     │        |   Fairchild MOC3052 (600V)     |  │     │</w:t>
+              <w:br/>
+              <w:t xml:space="preserve">                                                     │        |   [ Pin 6: Output Main Term ]  |  │     │</w:t>
+              <w:br/>
+              <w:t xml:space="preserve">                                                     │        |        │                       |  │     │</w:t>
+              <w:br/>
+              <w:t xml:space="preserve">                                                     │        |     [ R_lim: 330Ω / 1W ]       |  │     │</w:t>
+              <w:br/>
+              <w:t xml:space="preserve">                                                     │        |        │                       |  │     │</w:t>
+              <w:br/>
+              <w:t xml:space="preserve">                                                     │        |        +-----------------------|--|--+  │</w:t>
+              <w:br/>
+              <w:t xml:space="preserve">                                                     │        |        │                       |  │  |  │</w:t>
+              <w:br/>
+              <w:t xml:space="preserve">                                                     │        |   [ Pin 4: Output Trigger ]    |  │  |  │</w:t>
+              <w:br/>
+              <w:t xml:space="preserve">                                                     │        |        │                       |  │  |  │</w:t>
+              <w:br/>
+              <w:t xml:space="preserve">                                                     │        |        +-----------------------|--|--|--+</w:t>
+              <w:br/>
+              <w:t xml:space="preserve">                                                     │        |                                |  │  |  │</w:t>
+              <w:br/>
+              <w:t xml:space="preserve">                                                     │        |   [ Pin 1: LED Anode (+) ]     |  │  |  │</w:t>
+              <w:br/>
+              <w:t xml:space="preserve">                                                     │        |   [ Pin 2: LED Cathode (-) ]   |  │  |  │</w:t>
+              <w:br/>
+              <w:t xml:space="preserve">                                                     │        +--------+--------------+--------+  │  |  │</w:t>
+              <w:br/>
+              <w:t xml:space="preserve">                                                     │                 |              |           │  |  │</w:t>
+              <w:br/>
+              <w:t xml:space="preserve">                                                     │              PWM_TRIG        GND_ISO       │  |  │</w:t>
+              <w:br/>
+              <w:t xml:space="preserve">                                                     │             (From MCU)                     │  |  │</w:t>
+              <w:br/>
+              <w:t xml:space="preserve">                                                     │                                            │  |  │</w:t>
+              <w:br/>
+              <w:t xml:space="preserve">                                                 Anode (A)      T1: FORWARD THYRISTOR             │  |  │</w:t>
+              <w:br/>
+              <w:t xml:space="preserve">                                                ┌────┴──────────┐ (Vishay 25TTS12: 1200V/25A)     │  |  │</w:t>
+              <w:br/>
+              <w:t xml:space="preserve">                                         +-----&gt;│               │&lt;--------------------------------+  │  │</w:t>
+              <w:br/>
+              <w:t xml:space="preserve">                                         |      └────┬──────────┘ (Gate 1)                           │  │</w:t>
+              <w:br/>
+              <w:t xml:space="preserve">                                         |     Cath  │                                               │  │</w:t>
+              <w:br/>
+              <w:t xml:space="preserve">                                         |           +================================+              │  │</w:t>
+              <w:br/>
+              <w:t xml:space="preserve">                                         |           |                                |              │  │</w:t>
+              <w:br/>
+              <w:t xml:space="preserve">                                         |       Cath│          T2: REVERSE THYRISTOR |              │  │</w:t>
+              <w:br/>
+              <w:t xml:space="preserve">                                         |      ┌────┴──────────┐ (Anti-Parallel SCR) │              │  │</w:t>
+              <w:br/>
+              <w:t xml:space="preserve">                                         |      │               │&lt;--------------------+--------------+  │</w:t>
+              <w:br/>
+              <w:t xml:space="preserve">                                         |      └────┬──────────┘ (Gate 2)            │                 │</w:t>
+              <w:br/>
+              <w:t xml:space="preserve">                                         |     Anode │                                │                 │</w:t>
+              <w:br/>
+              <w:t xml:space="preserve">                                         |           │                                │                 │</w:t>
+              <w:br/>
+              <w:t xml:space="preserve">                                         +-----------+--[ R_snub: 47Ω / 5W Wirewound ]+                 │</w:t>
+              <w:br/>
+              <w:t xml:space="preserve">                                                     |         │                                        │</w:t>
+              <w:br/>
+              <w:t xml:space="preserve">                                                     |   [ C_snub: 0.1µF / 630V Film ]                  │</w:t>
+              <w:br/>
+              <w:t xml:space="preserve">                                                     |         │                                        │</w:t>
+              <w:br/>
+              <w:t xml:space="preserve">                                                     +---------+                                        │</w:t>
+              <w:br/>
+              <w:t xml:space="preserve">                                                     │                                                  │</w:t>
+              <w:br/>
+              <w:t xml:space="preserve">                                                     +=== PHASE-CONTROLLED AC OUTPUT (V_out)            │</w:t>
+              <w:br/>
+              <w:t xml:space="preserve">                                                     │    (RMS Voltage: 0V to 230V Adjustable)          │</w:t>
+              <w:br/>
+              <w:t xml:space="preserve">                                                     │                                                  │</w:t>
+              <w:br/>
+              <w:t xml:space="preserve">                                                    ┌┴────────────────────────────────────────────────┐ │</w:t>
+              <w:br/>
+              <w:t xml:space="preserve">                                                    │ AC MOTOR / HEATER LOAD (Z_L = R + jωL)          │ │</w:t>
+              <w:br/>
+              <w:t xml:space="preserve">                                                    │ - Resistance: R = 15Ω                           │ │</w:t>
+              <w:br/>
+              <w:t xml:space="preserve">                                                    │ - Inductance: L = 30mH                          │ │</w:t>
+              <w:br/>
+              <w:t xml:space="preserve">                                                    └┬────────────────────────────────────────────────┘ │</w:t>
+              <w:br/>
+              <w:t xml:space="preserve">                                                     │                                                  │</w:t>
+              <w:br/>
+              <w:t xml:space="preserve">    AC NEUTRAL (Return) ─────────────────────────────┴──────────────────────────────────────────────────┴─── AC NEUTRAL</w:t>
+            </w:r>
+          </w:p>
+        </w:tc>
+      </w:tr>
+    </w:tbl>
+    <w:p/>
+    <w:p>
+      <w:pPr>
+        <w:spacing w:before="160" w:after="80"/>
+      </w:pPr>
+      <w:r>
+        <w:rPr>
+          <w:b/>
+          <w:color w:val="4682B4"/>
+          <w:sz w:val="24"/>
+        </w:rPr>
+        <w:t>1.1 Detailed Component Connection Netlist &amp; Terminal Details:</w:t>
+      </w:r>
+    </w:p>
+    <w:tbl>
+      <w:tblPr>
+        <w:tblW w:type="auto" w:w="0"/>
+        <w:jc w:val="center"/>
+        <w:tblLook w:firstColumn="1" w:firstRow="1" w:lastColumn="0" w:lastRow="0" w:noHBand="0" w:noVBand="1" w:val="04A0"/>
+        <w:tblBorders>
+          <w:top w:val="single" w:sz="4" w:space="0" w:color="D0D7DE"/>
+          <w:left w:val="none"/>
+          <w:bottom w:val="single" w:sz="8" w:space="0" w:color="D0D7DE"/>
+          <w:right w:val="none"/>
+          <w:insideH w:val="single" w:sz="4" w:space="0" w:color="D0D7DE"/>
+          <w:insideV w:val="none"/>
+        </w:tblBorders>
+      </w:tblPr>
+      <w:tblGrid>
+        <w:gridCol w:w="1958"/>
+        <w:gridCol w:w="1958"/>
+        <w:gridCol w:w="1958"/>
+        <w:gridCol w:w="1958"/>
+        <w:gridCol w:w="1958"/>
+      </w:tblGrid>
+      <w:tr>
+        <w:tc>
+          <w:tcPr>
+            <w:tcW w:type="dxa" w:w="1958"/>
+            <w:shd w:fill="204A6E"/>
+            <w:tcMar>
+              <w:top w:w="100" w:type="dxa"/>
+              <w:bottom w:w="100" w:type="dxa"/>
+              <w:left w:w="120" w:type="dxa"/>
+              <w:right w:w="120" w:type="dxa"/>
+            </w:tcMar>
+            <w:vAlign w:val="center"/>
+          </w:tcPr>
+          <w:p>
+            <w:pPr>
+              <w:spacing w:after="0"/>
+            </w:pPr>
+            <w:r>
+              <w:rPr>
+                <w:b/>
+                <w:color w:val="FFFFFF"/>
+                <w:sz w:val="19"/>
+              </w:rPr>
+              <w:t>Net Name</w:t>
+            </w:r>
+          </w:p>
+        </w:tc>
+        <w:tc>
+          <w:tcPr>
+            <w:tcW w:type="dxa" w:w="1958"/>
+            <w:shd w:fill="204A6E"/>
+            <w:tcMar>
+              <w:top w:w="100" w:type="dxa"/>
+              <w:bottom w:w="100" w:type="dxa"/>
+              <w:left w:w="120" w:type="dxa"/>
+              <w:right w:w="120" w:type="dxa"/>
+            </w:tcMar>
+            <w:vAlign w:val="center"/>
+          </w:tcPr>
+          <w:p>
+            <w:pPr>
+              <w:spacing w:after="0"/>
+            </w:pPr>
+            <w:r>
+              <w:rPr>
+                <w:b/>
+                <w:color w:val="FFFFFF"/>
+                <w:sz w:val="19"/>
+              </w:rPr>
+              <w:t>Source (Pin / Terminal)</w:t>
+            </w:r>
+          </w:p>
+        </w:tc>
+        <w:tc>
+          <w:tcPr>
+            <w:tcW w:type="dxa" w:w="1958"/>
+            <w:shd w:fill="204A6E"/>
+            <w:tcMar>
+              <w:top w:w="100" w:type="dxa"/>
+              <w:bottom w:w="100" w:type="dxa"/>
+              <w:left w:w="120" w:type="dxa"/>
+              <w:right w:w="120" w:type="dxa"/>
+            </w:tcMar>
+            <w:vAlign w:val="center"/>
+          </w:tcPr>
+          <w:p>
+            <w:pPr>
+              <w:spacing w:after="0"/>
+            </w:pPr>
+            <w:r>
+              <w:rPr>
+                <w:b/>
+                <w:color w:val="FFFFFF"/>
+                <w:sz w:val="19"/>
+              </w:rPr>
+              <w:t>Destination (Pin / Terminal)</w:t>
+            </w:r>
+          </w:p>
+        </w:tc>
+        <w:tc>
+          <w:tcPr>
+            <w:tcW w:type="dxa" w:w="1958"/>
+            <w:shd w:fill="204A6E"/>
+            <w:tcMar>
+              <w:top w:w="100" w:type="dxa"/>
+              <w:bottom w:w="100" w:type="dxa"/>
+              <w:left w:w="120" w:type="dxa"/>
+              <w:right w:w="120" w:type="dxa"/>
+            </w:tcMar>
+            <w:vAlign w:val="center"/>
+          </w:tcPr>
+          <w:p>
+            <w:pPr>
+              <w:spacing w:after="0"/>
+            </w:pPr>
+            <w:r>
+              <w:rPr>
+                <w:b/>
+                <w:color w:val="FFFFFF"/>
+                <w:sz w:val="19"/>
+              </w:rPr>
+              <w:t>Electrical Function</w:t>
+            </w:r>
+          </w:p>
+        </w:tc>
+        <w:tc>
+          <w:tcPr>
+            <w:tcW w:type="dxa" w:w="1958"/>
+            <w:shd w:fill="204A6E"/>
+            <w:tcMar>
+              <w:top w:w="100" w:type="dxa"/>
+              <w:bottom w:w="100" w:type="dxa"/>
+              <w:left w:w="120" w:type="dxa"/>
+              <w:right w:w="120" w:type="dxa"/>
+            </w:tcMar>
+            <w:vAlign w:val="center"/>
+          </w:tcPr>
+          <w:p>
+            <w:pPr>
+              <w:spacing w:after="0"/>
+            </w:pPr>
+            <w:r>
+              <w:rPr>
+                <w:b/>
+                <w:color w:val="FFFFFF"/>
+                <w:sz w:val="19"/>
+              </w:rPr>
+              <w:t>Hardware Engineering Notes</w:t>
+            </w:r>
+          </w:p>
+        </w:tc>
+      </w:tr>
+      <w:tr>
+        <w:tc>
+          <w:tcPr>
+            <w:tcW w:type="dxa" w:w="1958"/>
+            <w:tcMar>
+              <w:top w:w="80" w:type="dxa"/>
+              <w:bottom w:w="80" w:type="dxa"/>
+              <w:left w:w="120" w:type="dxa"/>
+              <w:right w:w="120" w:type="dxa"/>
+            </w:tcMar>
+            <w:vAlign w:val="center"/>
+          </w:tcPr>
+          <w:p>
+            <w:pPr>
+              <w:spacing w:after="0"/>
+            </w:pPr>
+            <w:r>
+              <w:rPr>
+                <w:b/>
+                <w:color w:val="282C34"/>
+                <w:sz w:val="18"/>
+              </w:rPr>
+              <w:t>AC_LINE_IN</w:t>
+            </w:r>
+          </w:p>
+        </w:tc>
+        <w:tc>
+          <w:tcPr>
+            <w:tcW w:type="dxa" w:w="1958"/>
+            <w:tcMar>
+              <w:top w:w="80" w:type="dxa"/>
+              <w:bottom w:w="80" w:type="dxa"/>
+              <w:left w:w="120" w:type="dxa"/>
+              <w:right w:w="120" w:type="dxa"/>
+            </w:tcMar>
+            <w:vAlign w:val="center"/>
+          </w:tcPr>
+          <w:p>
+            <w:pPr>
+              <w:spacing w:after="0"/>
+            </w:pPr>
+            <w:r>
+              <w:rPr>
+                <w:color w:val="282C34"/>
+                <w:sz w:val="18"/>
+              </w:rPr>
+              <w:t>Input Terminal Block (L)</w:t>
+            </w:r>
+          </w:p>
+        </w:tc>
+        <w:tc>
+          <w:tcPr>
+            <w:tcW w:type="dxa" w:w="1958"/>
+            <w:tcMar>
+              <w:top w:w="80" w:type="dxa"/>
+              <w:bottom w:w="80" w:type="dxa"/>
+              <w:left w:w="120" w:type="dxa"/>
+              <w:right w:w="120" w:type="dxa"/>
+            </w:tcMar>
+            <w:vAlign w:val="center"/>
+          </w:tcPr>
+          <w:p>
+            <w:pPr>
+              <w:spacing w:after="0"/>
+            </w:pPr>
+            <w:r>
+              <w:rPr>
+                <w:color w:val="282C34"/>
+                <w:sz w:val="18"/>
+              </w:rPr>
+              <w:t xml:space="preserve">Fuse </w:t>
+            </w:r>
+            <w:r>
+              <w:rPr>
+                <w:i/>
+                <w:color w:val="145AA0"/>
+                <w:sz w:val="18"/>
+              </w:rPr>
+              <w:t>F_1</w:t>
+            </w:r>
+            <w:r>
+              <w:rPr>
+                <w:color w:val="282C34"/>
+                <w:sz w:val="18"/>
+              </w:rPr>
+              <w:t xml:space="preserve"> Input</w:t>
+            </w:r>
+          </w:p>
+        </w:tc>
+        <w:tc>
+          <w:tcPr>
+            <w:tcW w:type="dxa" w:w="1958"/>
+            <w:tcMar>
+              <w:top w:w="80" w:type="dxa"/>
+              <w:bottom w:w="80" w:type="dxa"/>
+              <w:left w:w="120" w:type="dxa"/>
+              <w:right w:w="120" w:type="dxa"/>
+            </w:tcMar>
+            <w:vAlign w:val="center"/>
+          </w:tcPr>
+          <w:p>
+            <w:pPr>
+              <w:spacing w:after="0"/>
+            </w:pPr>
+            <w:r>
+              <w:rPr>
+                <w:color w:val="282C34"/>
+                <w:sz w:val="18"/>
+              </w:rPr>
+              <w:t>230V AC 50Hz utility input line</w:t>
+            </w:r>
+          </w:p>
+        </w:tc>
+        <w:tc>
+          <w:tcPr>
+            <w:tcW w:type="dxa" w:w="1958"/>
+            <w:tcMar>
+              <w:top w:w="80" w:type="dxa"/>
+              <w:bottom w:w="80" w:type="dxa"/>
+              <w:left w:w="120" w:type="dxa"/>
+              <w:right w:w="120" w:type="dxa"/>
+            </w:tcMar>
+            <w:vAlign w:val="center"/>
+          </w:tcPr>
+          <w:p>
+            <w:pPr>
+              <w:spacing w:after="0"/>
+            </w:pPr>
+            <w:r>
+              <w:rPr>
+                <w:color w:val="282C34"/>
+                <w:sz w:val="18"/>
+              </w:rPr>
+              <w:t>Time-lag ceramic fuse accommodates inrush current of inductive loads.</w:t>
+            </w:r>
+          </w:p>
+        </w:tc>
+      </w:tr>
+      <w:tr>
+        <w:tc>
+          <w:tcPr>
+            <w:tcW w:type="dxa" w:w="1958"/>
+            <w:shd w:fill="F4F7F9"/>
+            <w:tcMar>
+              <w:top w:w="80" w:type="dxa"/>
+              <w:bottom w:w="80" w:type="dxa"/>
+              <w:left w:w="120" w:type="dxa"/>
+              <w:right w:w="120" w:type="dxa"/>
+            </w:tcMar>
+            <w:vAlign w:val="center"/>
+          </w:tcPr>
+          <w:p>
+            <w:pPr>
+              <w:spacing w:after="0"/>
+            </w:pPr>
+            <w:r>
+              <w:rPr>
+                <w:b/>
+                <w:color w:val="282C34"/>
+                <w:sz w:val="18"/>
+              </w:rPr>
+              <w:t>AC_LINE_SW</w:t>
+            </w:r>
+          </w:p>
+        </w:tc>
+        <w:tc>
+          <w:tcPr>
+            <w:tcW w:type="dxa" w:w="1958"/>
+            <w:shd w:fill="F4F7F9"/>
+            <w:tcMar>
+              <w:top w:w="80" w:type="dxa"/>
+              <w:bottom w:w="80" w:type="dxa"/>
+              <w:left w:w="120" w:type="dxa"/>
+              <w:right w:w="120" w:type="dxa"/>
+            </w:tcMar>
+            <w:vAlign w:val="center"/>
+          </w:tcPr>
+          <w:p>
+            <w:pPr>
+              <w:spacing w:after="0"/>
+            </w:pPr>
+            <w:r>
+              <w:rPr>
+                <w:color w:val="282C34"/>
+                <w:sz w:val="18"/>
+              </w:rPr>
+              <w:t xml:space="preserve">Fuse </w:t>
+            </w:r>
+            <w:r>
+              <w:rPr>
+                <w:i/>
+                <w:color w:val="145AA0"/>
+                <w:sz w:val="18"/>
+              </w:rPr>
+              <w:t>F_1</w:t>
+            </w:r>
+            <w:r>
+              <w:rPr>
+                <w:color w:val="282C34"/>
+                <w:sz w:val="18"/>
+              </w:rPr>
+              <w:t xml:space="preserve"> Output</w:t>
+            </w:r>
+          </w:p>
+        </w:tc>
+        <w:tc>
+          <w:tcPr>
+            <w:tcW w:type="dxa" w:w="1958"/>
+            <w:shd w:fill="F4F7F9"/>
+            <w:tcMar>
+              <w:top w:w="80" w:type="dxa"/>
+              <w:bottom w:w="80" w:type="dxa"/>
+              <w:left w:w="120" w:type="dxa"/>
+              <w:right w:w="120" w:type="dxa"/>
+            </w:tcMar>
+            <w:vAlign w:val="center"/>
+          </w:tcPr>
+          <w:p>
+            <w:pPr>
+              <w:spacing w:after="0"/>
+            </w:pPr>
+            <w:r>
+              <w:rPr>
+                <w:i/>
+                <w:color w:val="145AA0"/>
+                <w:sz w:val="18"/>
+              </w:rPr>
+              <w:t>T_1</w:t>
+            </w:r>
+            <w:r>
+              <w:rPr>
+                <w:color w:val="282C34"/>
+                <w:sz w:val="18"/>
+              </w:rPr>
+              <w:t xml:space="preserve"> Anode, </w:t>
+            </w:r>
+            <w:r>
+              <w:rPr>
+                <w:i/>
+                <w:color w:val="145AA0"/>
+                <w:sz w:val="18"/>
+              </w:rPr>
+              <w:t>T_2</w:t>
+            </w:r>
+            <w:r>
+              <w:rPr>
+                <w:color w:val="282C34"/>
+                <w:sz w:val="18"/>
+              </w:rPr>
+              <w:t xml:space="preserve"> Cathode, Snubber, MOV1</w:t>
+            </w:r>
+          </w:p>
+        </w:tc>
+        <w:tc>
+          <w:tcPr>
+            <w:tcW w:type="dxa" w:w="1958"/>
+            <w:shd w:fill="F4F7F9"/>
+            <w:tcMar>
+              <w:top w:w="80" w:type="dxa"/>
+              <w:bottom w:w="80" w:type="dxa"/>
+              <w:left w:w="120" w:type="dxa"/>
+              <w:right w:w="120" w:type="dxa"/>
+            </w:tcMar>
+            <w:vAlign w:val="center"/>
+          </w:tcPr>
+          <w:p>
+            <w:pPr>
+              <w:spacing w:after="0"/>
+            </w:pPr>
+            <w:r>
+              <w:rPr>
+                <w:color w:val="282C34"/>
+                <w:sz w:val="18"/>
+              </w:rPr>
+              <w:t>Protected input AC rail</w:t>
+            </w:r>
+          </w:p>
+        </w:tc>
+        <w:tc>
+          <w:tcPr>
+            <w:tcW w:type="dxa" w:w="1958"/>
+            <w:shd w:fill="F4F7F9"/>
+            <w:tcMar>
+              <w:top w:w="80" w:type="dxa"/>
+              <w:bottom w:w="80" w:type="dxa"/>
+              <w:left w:w="120" w:type="dxa"/>
+              <w:right w:w="120" w:type="dxa"/>
+            </w:tcMar>
+            <w:vAlign w:val="center"/>
+          </w:tcPr>
+          <w:p>
+            <w:pPr>
+              <w:spacing w:after="0"/>
+            </w:pPr>
+            <w:r>
+              <w:rPr>
+                <w:color w:val="282C34"/>
+                <w:sz w:val="18"/>
+              </w:rPr>
+              <w:t>Direct input to the back-to-back anti-parallel SCR module.</w:t>
+            </w:r>
+          </w:p>
+        </w:tc>
+      </w:tr>
+      <w:tr>
+        <w:tc>
+          <w:tcPr>
+            <w:tcW w:type="dxa" w:w="1958"/>
+            <w:tcMar>
+              <w:top w:w="80" w:type="dxa"/>
+              <w:bottom w:w="80" w:type="dxa"/>
+              <w:left w:w="120" w:type="dxa"/>
+              <w:right w:w="120" w:type="dxa"/>
+            </w:tcMar>
+            <w:vAlign w:val="center"/>
+          </w:tcPr>
+          <w:p>
+            <w:pPr>
+              <w:spacing w:after="0"/>
+            </w:pPr>
+            <w:r>
+              <w:rPr>
+                <w:b/>
+                <w:color w:val="282C34"/>
+                <w:sz w:val="18"/>
+              </w:rPr>
+              <w:t>AC_CONTROLLED</w:t>
+            </w:r>
+          </w:p>
+        </w:tc>
+        <w:tc>
+          <w:tcPr>
+            <w:tcW w:type="dxa" w:w="1958"/>
+            <w:tcMar>
+              <w:top w:w="80" w:type="dxa"/>
+              <w:bottom w:w="80" w:type="dxa"/>
+              <w:left w:w="120" w:type="dxa"/>
+              <w:right w:w="120" w:type="dxa"/>
+            </w:tcMar>
+            <w:vAlign w:val="center"/>
+          </w:tcPr>
+          <w:p>
+            <w:pPr>
+              <w:spacing w:after="0"/>
+            </w:pPr>
+            <w:r>
+              <w:rPr>
+                <w:i/>
+                <w:color w:val="145AA0"/>
+                <w:sz w:val="18"/>
+              </w:rPr>
+              <w:t>T_1</w:t>
+            </w:r>
+            <w:r>
+              <w:rPr>
+                <w:color w:val="282C34"/>
+                <w:sz w:val="18"/>
+              </w:rPr>
+              <w:t xml:space="preserve"> Cathode, </w:t>
+            </w:r>
+            <w:r>
+              <w:rPr>
+                <w:i/>
+                <w:color w:val="145AA0"/>
+                <w:sz w:val="18"/>
+              </w:rPr>
+              <w:t>T_2</w:t>
+            </w:r>
+            <w:r>
+              <w:rPr>
+                <w:color w:val="282C34"/>
+                <w:sz w:val="18"/>
+              </w:rPr>
+              <w:t xml:space="preserve"> Anode</w:t>
+            </w:r>
+          </w:p>
+        </w:tc>
+        <w:tc>
+          <w:tcPr>
+            <w:tcW w:type="dxa" w:w="1958"/>
+            <w:tcMar>
+              <w:top w:w="80" w:type="dxa"/>
+              <w:bottom w:w="80" w:type="dxa"/>
+              <w:left w:w="120" w:type="dxa"/>
+              <w:right w:w="120" w:type="dxa"/>
+            </w:tcMar>
+            <w:vAlign w:val="center"/>
+          </w:tcPr>
+          <w:p>
+            <w:pPr>
+              <w:spacing w:after="0"/>
+            </w:pPr>
+            <w:r>
+              <w:rPr>
+                <w:color w:val="282C34"/>
+                <w:sz w:val="18"/>
+              </w:rPr>
+              <w:t>Snubber, Load Terminal 1</w:t>
+            </w:r>
+          </w:p>
+        </w:tc>
+        <w:tc>
+          <w:tcPr>
+            <w:tcW w:type="dxa" w:w="1958"/>
+            <w:tcMar>
+              <w:top w:w="80" w:type="dxa"/>
+              <w:bottom w:w="80" w:type="dxa"/>
+              <w:left w:w="120" w:type="dxa"/>
+              <w:right w:w="120" w:type="dxa"/>
+            </w:tcMar>
+            <w:vAlign w:val="center"/>
+          </w:tcPr>
+          <w:p>
+            <w:pPr>
+              <w:spacing w:after="0"/>
+            </w:pPr>
+            <w:r>
+              <w:rPr>
+                <w:color w:val="282C34"/>
+                <w:sz w:val="18"/>
+              </w:rPr>
+              <w:t>Phase-chopped AC output voltage</w:t>
+            </w:r>
+          </w:p>
+        </w:tc>
+        <w:tc>
+          <w:tcPr>
+            <w:tcW w:type="dxa" w:w="1958"/>
+            <w:tcMar>
+              <w:top w:w="80" w:type="dxa"/>
+              <w:bottom w:w="80" w:type="dxa"/>
+              <w:left w:w="120" w:type="dxa"/>
+              <w:right w:w="120" w:type="dxa"/>
+            </w:tcMar>
+            <w:vAlign w:val="center"/>
+          </w:tcPr>
+          <w:p>
+            <w:pPr>
+              <w:spacing w:after="0"/>
+            </w:pPr>
+            <w:r>
+              <w:rPr>
+                <w:color w:val="282C34"/>
+                <w:sz w:val="18"/>
+              </w:rPr>
+              <w:t xml:space="preserve">Waveform is sliced at firing angle </w:t>
+            </w:r>
+            <w:r>
+              <w:rPr>
+                <w:i/>
+                <w:color w:val="145AA0"/>
+                <w:sz w:val="18"/>
+              </w:rPr>
+              <w:t>\alpha</w:t>
+            </w:r>
+            <w:r>
+              <w:rPr>
+                <w:color w:val="282C34"/>
+                <w:sz w:val="18"/>
+              </w:rPr>
+              <w:t>; fundamental voltage is continuously variable.</w:t>
+            </w:r>
+          </w:p>
+        </w:tc>
+      </w:tr>
+      <w:tr>
+        <w:tc>
+          <w:tcPr>
+            <w:tcW w:type="dxa" w:w="1958"/>
+            <w:shd w:fill="F4F7F9"/>
+            <w:tcMar>
+              <w:top w:w="80" w:type="dxa"/>
+              <w:bottom w:w="80" w:type="dxa"/>
+              <w:left w:w="120" w:type="dxa"/>
+              <w:right w:w="120" w:type="dxa"/>
+            </w:tcMar>
+            <w:vAlign w:val="center"/>
+          </w:tcPr>
+          <w:p>
+            <w:pPr>
+              <w:spacing w:after="0"/>
+            </w:pPr>
+            <w:r>
+              <w:rPr>
+                <w:b/>
+                <w:color w:val="282C34"/>
+                <w:sz w:val="18"/>
+              </w:rPr>
+              <w:t>GATE_TRIG</w:t>
+            </w:r>
+          </w:p>
+        </w:tc>
+        <w:tc>
+          <w:tcPr>
+            <w:tcW w:type="dxa" w:w="1958"/>
+            <w:shd w:fill="F4F7F9"/>
+            <w:tcMar>
+              <w:top w:w="80" w:type="dxa"/>
+              <w:bottom w:w="80" w:type="dxa"/>
+              <w:left w:w="120" w:type="dxa"/>
+              <w:right w:w="120" w:type="dxa"/>
+            </w:tcMar>
+            <w:vAlign w:val="center"/>
+          </w:tcPr>
+          <w:p>
+            <w:pPr>
+              <w:spacing w:after="0"/>
+            </w:pPr>
+            <w:r>
+              <w:rPr>
+                <w:color w:val="282C34"/>
+                <w:sz w:val="18"/>
+              </w:rPr>
+              <w:t>MOC3052 Opto-TRIAC Pin 4</w:t>
+            </w:r>
+          </w:p>
+        </w:tc>
+        <w:tc>
+          <w:tcPr>
+            <w:tcW w:type="dxa" w:w="1958"/>
+            <w:shd w:fill="F4F7F9"/>
+            <w:tcMar>
+              <w:top w:w="80" w:type="dxa"/>
+              <w:bottom w:w="80" w:type="dxa"/>
+              <w:left w:w="120" w:type="dxa"/>
+              <w:right w:w="120" w:type="dxa"/>
+            </w:tcMar>
+            <w:vAlign w:val="center"/>
+          </w:tcPr>
+          <w:p>
+            <w:pPr>
+              <w:spacing w:after="0"/>
+            </w:pPr>
+            <w:r>
+              <w:rPr>
+                <w:i/>
+                <w:color w:val="145AA0"/>
+                <w:sz w:val="18"/>
+              </w:rPr>
+              <w:t>T_1 / T_2</w:t>
+            </w:r>
+            <w:r>
+              <w:rPr>
+                <w:color w:val="282C34"/>
+                <w:sz w:val="18"/>
+              </w:rPr>
+              <w:t xml:space="preserve"> Gate Terminals</w:t>
+            </w:r>
+          </w:p>
+        </w:tc>
+        <w:tc>
+          <w:tcPr>
+            <w:tcW w:type="dxa" w:w="1958"/>
+            <w:shd w:fill="F4F7F9"/>
+            <w:tcMar>
+              <w:top w:w="80" w:type="dxa"/>
+              <w:bottom w:w="80" w:type="dxa"/>
+              <w:left w:w="120" w:type="dxa"/>
+              <w:right w:w="120" w:type="dxa"/>
+            </w:tcMar>
+            <w:vAlign w:val="center"/>
+          </w:tcPr>
+          <w:p>
+            <w:pPr>
+              <w:spacing w:after="0"/>
+            </w:pPr>
+            <w:r>
+              <w:rPr>
+                <w:color w:val="282C34"/>
+                <w:sz w:val="18"/>
+              </w:rPr>
+              <w:t>Optically isolated firing pulses</w:t>
+            </w:r>
+          </w:p>
+        </w:tc>
+        <w:tc>
+          <w:tcPr>
+            <w:tcW w:type="dxa" w:w="1958"/>
+            <w:shd w:fill="F4F7F9"/>
+            <w:tcMar>
+              <w:top w:w="80" w:type="dxa"/>
+              <w:bottom w:w="80" w:type="dxa"/>
+              <w:left w:w="120" w:type="dxa"/>
+              <w:right w:w="120" w:type="dxa"/>
+            </w:tcMar>
+            <w:vAlign w:val="center"/>
+          </w:tcPr>
+          <w:p>
+            <w:pPr>
+              <w:spacing w:after="0"/>
+            </w:pPr>
+            <w:r>
+              <w:rPr>
+                <w:color w:val="282C34"/>
+                <w:sz w:val="18"/>
+              </w:rPr>
+              <w:t>Zero-crossing or random-phase triggering depending on phase-angle vs burst mode.</w:t>
+            </w:r>
+          </w:p>
+        </w:tc>
+      </w:tr>
+      <w:tr>
+        <w:tc>
+          <w:tcPr>
+            <w:tcW w:type="dxa" w:w="1958"/>
+            <w:tcMar>
+              <w:top w:w="80" w:type="dxa"/>
+              <w:bottom w:w="80" w:type="dxa"/>
+              <w:left w:w="120" w:type="dxa"/>
+              <w:right w:w="120" w:type="dxa"/>
+            </w:tcMar>
+            <w:vAlign w:val="center"/>
+          </w:tcPr>
+          <w:p>
+            <w:pPr>
+              <w:spacing w:after="0"/>
+            </w:pPr>
+            <w:r>
+              <w:rPr>
+                <w:b/>
+                <w:color w:val="282C34"/>
+                <w:sz w:val="18"/>
+              </w:rPr>
+              <w:t>LOAD_RETURN</w:t>
+            </w:r>
+          </w:p>
+        </w:tc>
+        <w:tc>
+          <w:tcPr>
+            <w:tcW w:type="dxa" w:w="1958"/>
+            <w:tcMar>
+              <w:top w:w="80" w:type="dxa"/>
+              <w:bottom w:w="80" w:type="dxa"/>
+              <w:left w:w="120" w:type="dxa"/>
+              <w:right w:w="120" w:type="dxa"/>
+            </w:tcMar>
+            <w:vAlign w:val="center"/>
+          </w:tcPr>
+          <w:p>
+            <w:pPr>
+              <w:spacing w:after="0"/>
+            </w:pPr>
+            <w:r>
+              <w:rPr>
+                <w:color w:val="282C34"/>
+                <w:sz w:val="18"/>
+              </w:rPr>
+              <w:t>Load Terminal 2</w:t>
+            </w:r>
+          </w:p>
+        </w:tc>
+        <w:tc>
+          <w:tcPr>
+            <w:tcW w:type="dxa" w:w="1958"/>
+            <w:tcMar>
+              <w:top w:w="80" w:type="dxa"/>
+              <w:bottom w:w="80" w:type="dxa"/>
+              <w:left w:w="120" w:type="dxa"/>
+              <w:right w:w="120" w:type="dxa"/>
+            </w:tcMar>
+            <w:vAlign w:val="center"/>
+          </w:tcPr>
+          <w:p>
+            <w:pPr>
+              <w:spacing w:after="0"/>
+            </w:pPr>
+            <w:r>
+              <w:rPr>
+                <w:color w:val="282C34"/>
+                <w:sz w:val="18"/>
+              </w:rPr>
+              <w:t>AC Neutral Terminal Block (N)</w:t>
+            </w:r>
+          </w:p>
+        </w:tc>
+        <w:tc>
+          <w:tcPr>
+            <w:tcW w:type="dxa" w:w="1958"/>
+            <w:tcMar>
+              <w:top w:w="80" w:type="dxa"/>
+              <w:bottom w:w="80" w:type="dxa"/>
+              <w:left w:w="120" w:type="dxa"/>
+              <w:right w:w="120" w:type="dxa"/>
+            </w:tcMar>
+            <w:vAlign w:val="center"/>
+          </w:tcPr>
+          <w:p>
+            <w:pPr>
+              <w:spacing w:after="0"/>
+            </w:pPr>
+            <w:r>
+              <w:rPr>
+                <w:color w:val="282C34"/>
+                <w:sz w:val="18"/>
+              </w:rPr>
+              <w:t>AC mains neutral return path</w:t>
+            </w:r>
+          </w:p>
+        </w:tc>
+        <w:tc>
+          <w:tcPr>
+            <w:tcW w:type="dxa" w:w="1958"/>
+            <w:tcMar>
+              <w:top w:w="80" w:type="dxa"/>
+              <w:bottom w:w="80" w:type="dxa"/>
+              <w:left w:w="120" w:type="dxa"/>
+              <w:right w:w="120" w:type="dxa"/>
+            </w:tcMar>
+            <w:vAlign w:val="center"/>
+          </w:tcPr>
+          <w:p>
+            <w:pPr>
+              <w:spacing w:after="0"/>
+            </w:pPr>
+            <w:r>
+              <w:rPr>
+                <w:color w:val="282C34"/>
+                <w:sz w:val="18"/>
+              </w:rPr>
+              <w:t>Heavy-gauge line wiring sized for 16A continuous current.</w:t>
+            </w:r>
+          </w:p>
+        </w:tc>
+      </w:tr>
+    </w:tbl>
+    <w:p/>
+    <w:p>
+      <w:pPr>
+        <w:spacing w:before="160" w:after="80"/>
+      </w:pPr>
+      <w:r>
+        <w:rPr>
+          <w:b/>
+          <w:color w:val="4682B4"/>
+          <w:sz w:val="24"/>
+        </w:rPr>
+        <w:t>1.2 Component Bill of Materials &amp; Parametric Specifications:</w:t>
+      </w:r>
+    </w:p>
+    <w:tbl>
+      <w:tblPr>
+        <w:tblW w:type="auto" w:w="0"/>
+        <w:jc w:val="center"/>
+        <w:tblLook w:firstColumn="1" w:firstRow="1" w:lastColumn="0" w:lastRow="0" w:noHBand="0" w:noVBand="1" w:val="04A0"/>
+        <w:tblBorders>
+          <w:top w:val="single" w:sz="4" w:space="0" w:color="D0D7DE"/>
+          <w:left w:val="none"/>
+          <w:bottom w:val="single" w:sz="8" w:space="0" w:color="D0D7DE"/>
+          <w:right w:val="none"/>
+          <w:insideH w:val="single" w:sz="4" w:space="0" w:color="D0D7DE"/>
+          <w:insideV w:val="none"/>
+        </w:tblBorders>
+      </w:tblPr>
+      <w:tblGrid>
+        <w:gridCol w:w="1958"/>
+        <w:gridCol w:w="1958"/>
+        <w:gridCol w:w="1958"/>
+        <w:gridCol w:w="1958"/>
+        <w:gridCol w:w="1958"/>
+      </w:tblGrid>
+      <w:tr>
+        <w:tc>
+          <w:tcPr>
+            <w:tcW w:type="dxa" w:w="1958"/>
+            <w:shd w:fill="204A6E"/>
+            <w:tcMar>
+              <w:top w:w="100" w:type="dxa"/>
+              <w:bottom w:w="100" w:type="dxa"/>
+              <w:left w:w="120" w:type="dxa"/>
+              <w:right w:w="120" w:type="dxa"/>
+            </w:tcMar>
+            <w:vAlign w:val="center"/>
+          </w:tcPr>
+          <w:p>
+            <w:pPr>
+              <w:spacing w:after="0"/>
+            </w:pPr>
+            <w:r>
+              <w:rPr>
+                <w:b/>
+                <w:color w:val="FFFFFF"/>
+                <w:sz w:val="19"/>
+              </w:rPr>
+              <w:t>RefDes</w:t>
+            </w:r>
+          </w:p>
+        </w:tc>
+        <w:tc>
+          <w:tcPr>
+            <w:tcW w:type="dxa" w:w="1958"/>
+            <w:shd w:fill="204A6E"/>
+            <w:tcMar>
+              <w:top w:w="100" w:type="dxa"/>
+              <w:bottom w:w="100" w:type="dxa"/>
+              <w:left w:w="120" w:type="dxa"/>
+              <w:right w:w="120" w:type="dxa"/>
+            </w:tcMar>
+            <w:vAlign w:val="center"/>
+          </w:tcPr>
+          <w:p>
+            <w:pPr>
+              <w:spacing w:after="0"/>
+            </w:pPr>
+            <w:r>
+              <w:rPr>
+                <w:b/>
+                <w:color w:val="FFFFFF"/>
+                <w:sz w:val="19"/>
+              </w:rPr>
+              <w:t>Component Description</w:t>
+            </w:r>
+          </w:p>
+        </w:tc>
+        <w:tc>
+          <w:tcPr>
+            <w:tcW w:type="dxa" w:w="1958"/>
+            <w:shd w:fill="204A6E"/>
+            <w:tcMar>
+              <w:top w:w="100" w:type="dxa"/>
+              <w:bottom w:w="100" w:type="dxa"/>
+              <w:left w:w="120" w:type="dxa"/>
+              <w:right w:w="120" w:type="dxa"/>
+            </w:tcMar>
+            <w:vAlign w:val="center"/>
+          </w:tcPr>
+          <w:p>
+            <w:pPr>
+              <w:spacing w:after="0"/>
+            </w:pPr>
+            <w:r>
+              <w:rPr>
+                <w:b/>
+                <w:color w:val="FFFFFF"/>
+                <w:sz w:val="19"/>
+              </w:rPr>
+              <w:t>Manufacturer &amp; Part Number</w:t>
+            </w:r>
+          </w:p>
+        </w:tc>
+        <w:tc>
+          <w:tcPr>
+            <w:tcW w:type="dxa" w:w="1958"/>
+            <w:shd w:fill="204A6E"/>
+            <w:tcMar>
+              <w:top w:w="100" w:type="dxa"/>
+              <w:bottom w:w="100" w:type="dxa"/>
+              <w:left w:w="120" w:type="dxa"/>
+              <w:right w:w="120" w:type="dxa"/>
+            </w:tcMar>
+            <w:vAlign w:val="center"/>
+          </w:tcPr>
+          <w:p>
+            <w:pPr>
+              <w:spacing w:after="0"/>
+            </w:pPr>
+            <w:r>
+              <w:rPr>
+                <w:b/>
+                <w:color w:val="FFFFFF"/>
+                <w:sz w:val="19"/>
+              </w:rPr>
+              <w:t>Key Electrical Specifications</w:t>
+            </w:r>
+          </w:p>
+        </w:tc>
+        <w:tc>
+          <w:tcPr>
+            <w:tcW w:type="dxa" w:w="1958"/>
+            <w:shd w:fill="204A6E"/>
+            <w:tcMar>
+              <w:top w:w="100" w:type="dxa"/>
+              <w:bottom w:w="100" w:type="dxa"/>
+              <w:left w:w="120" w:type="dxa"/>
+              <w:right w:w="120" w:type="dxa"/>
+            </w:tcMar>
+            <w:vAlign w:val="center"/>
+          </w:tcPr>
+          <w:p>
+            <w:pPr>
+              <w:spacing w:after="0"/>
+            </w:pPr>
+            <w:r>
+              <w:rPr>
+                <w:b/>
+                <w:color w:val="FFFFFF"/>
+                <w:sz w:val="19"/>
+              </w:rPr>
+              <w:t>Critical Design Constraint</w:t>
+            </w:r>
+          </w:p>
+        </w:tc>
+      </w:tr>
+      <w:tr>
+        <w:tc>
+          <w:tcPr>
+            <w:tcW w:type="dxa" w:w="1958"/>
+            <w:tcMar>
+              <w:top w:w="80" w:type="dxa"/>
+              <w:bottom w:w="80" w:type="dxa"/>
+              <w:left w:w="120" w:type="dxa"/>
+              <w:right w:w="120" w:type="dxa"/>
+            </w:tcMar>
+            <w:vAlign w:val="center"/>
+          </w:tcPr>
+          <w:p>
+            <w:pPr>
+              <w:spacing w:after="0"/>
+            </w:pPr>
+            <w:r>
+              <w:rPr>
+                <w:b/>
+                <w:color w:val="282C34"/>
+                <w:sz w:val="18"/>
+              </w:rPr>
+              <w:t>$T_1, T_2$</w:t>
+            </w:r>
+          </w:p>
+        </w:tc>
+        <w:tc>
+          <w:tcPr>
+            <w:tcW w:type="dxa" w:w="1958"/>
+            <w:tcMar>
+              <w:top w:w="80" w:type="dxa"/>
+              <w:bottom w:w="80" w:type="dxa"/>
+              <w:left w:w="120" w:type="dxa"/>
+              <w:right w:w="120" w:type="dxa"/>
+            </w:tcMar>
+            <w:vAlign w:val="center"/>
+          </w:tcPr>
+          <w:p>
+            <w:pPr>
+              <w:spacing w:after="0"/>
+            </w:pPr>
+            <w:r>
+              <w:rPr>
+                <w:color w:val="282C34"/>
+                <w:sz w:val="18"/>
+              </w:rPr>
+              <w:t>Phase-Control Thyristor Pair</w:t>
+            </w:r>
+          </w:p>
+        </w:tc>
+        <w:tc>
+          <w:tcPr>
+            <w:tcW w:type="dxa" w:w="1958"/>
+            <w:tcMar>
+              <w:top w:w="80" w:type="dxa"/>
+              <w:bottom w:w="80" w:type="dxa"/>
+              <w:left w:w="120" w:type="dxa"/>
+              <w:right w:w="120" w:type="dxa"/>
+            </w:tcMar>
+            <w:vAlign w:val="center"/>
+          </w:tcPr>
+          <w:p>
+            <w:pPr>
+              <w:spacing w:after="0"/>
+            </w:pPr>
+            <w:r>
+              <w:rPr>
+                <w:color w:val="282C34"/>
+                <w:sz w:val="18"/>
+              </w:rPr>
+              <w:t>Vishay Semiconductors 25TTS12</w:t>
+            </w:r>
+          </w:p>
+        </w:tc>
+        <w:tc>
+          <w:tcPr>
+            <w:tcW w:type="dxa" w:w="1958"/>
+            <w:tcMar>
+              <w:top w:w="80" w:type="dxa"/>
+              <w:bottom w:w="80" w:type="dxa"/>
+              <w:left w:w="120" w:type="dxa"/>
+              <w:right w:w="120" w:type="dxa"/>
+            </w:tcMar>
+            <w:vAlign w:val="center"/>
+          </w:tcPr>
+          <w:p>
+            <w:pPr>
+              <w:spacing w:after="0"/>
+            </w:pPr>
+            <w:r>
+              <w:rPr>
+                <w:i/>
+                <w:color w:val="145AA0"/>
+                <w:sz w:val="18"/>
+              </w:rPr>
+              <w:t>V_{RRM = 1200\,V, I_{T(AV) = 16\,A, I_{GT = 45\,mA, V_{TM = 1.25\,V</w:t>
+            </w:r>
+          </w:p>
+        </w:tc>
+        <w:tc>
+          <w:tcPr>
+            <w:tcW w:type="dxa" w:w="1958"/>
+            <w:tcMar>
+              <w:top w:w="80" w:type="dxa"/>
+              <w:bottom w:w="80" w:type="dxa"/>
+              <w:left w:w="120" w:type="dxa"/>
+              <w:right w:w="120" w:type="dxa"/>
+            </w:tcMar>
+            <w:vAlign w:val="center"/>
+          </w:tcPr>
+          <w:p>
+            <w:pPr>
+              <w:spacing w:after="0"/>
+            </w:pPr>
+            <w:r>
+              <w:rPr>
+                <w:i/>
+                <w:color w:val="145AA0"/>
+                <w:sz w:val="18"/>
+              </w:rPr>
+              <w:t>1200\,V</w:t>
+            </w:r>
+            <w:r>
+              <w:rPr>
+                <w:color w:val="282C34"/>
+                <w:sz w:val="18"/>
+              </w:rPr>
+              <w:t xml:space="preserve"> rating ensures safe margins during inductive turn-off voltage kickback.</w:t>
+            </w:r>
+          </w:p>
+        </w:tc>
+      </w:tr>
+      <w:tr>
+        <w:tc>
+          <w:tcPr>
+            <w:tcW w:type="dxa" w:w="1958"/>
+            <w:shd w:fill="F4F7F9"/>
+            <w:tcMar>
+              <w:top w:w="80" w:type="dxa"/>
+              <w:bottom w:w="80" w:type="dxa"/>
+              <w:left w:w="120" w:type="dxa"/>
+              <w:right w:w="120" w:type="dxa"/>
+            </w:tcMar>
+            <w:vAlign w:val="center"/>
+          </w:tcPr>
+          <w:p>
+            <w:pPr>
+              <w:spacing w:after="0"/>
+            </w:pPr>
+            <w:r>
+              <w:rPr>
+                <w:b/>
+                <w:color w:val="282C34"/>
+                <w:sz w:val="18"/>
+              </w:rPr>
+              <w:t>$R_{snub}, C_{snub}$</w:t>
+            </w:r>
+          </w:p>
+        </w:tc>
+        <w:tc>
+          <w:tcPr>
+            <w:tcW w:type="dxa" w:w="1958"/>
+            <w:shd w:fill="F4F7F9"/>
+            <w:tcMar>
+              <w:top w:w="80" w:type="dxa"/>
+              <w:bottom w:w="80" w:type="dxa"/>
+              <w:left w:w="120" w:type="dxa"/>
+              <w:right w:w="120" w:type="dxa"/>
+            </w:tcMar>
+            <w:vAlign w:val="center"/>
+          </w:tcPr>
+          <w:p>
+            <w:pPr>
+              <w:spacing w:after="0"/>
+            </w:pPr>
+            <w:r>
+              <w:rPr>
+                <w:color w:val="282C34"/>
+                <w:sz w:val="18"/>
+              </w:rPr>
+              <w:t>AC Power Snubber Network</w:t>
+            </w:r>
+          </w:p>
+        </w:tc>
+        <w:tc>
+          <w:tcPr>
+            <w:tcW w:type="dxa" w:w="1958"/>
+            <w:shd w:fill="F4F7F9"/>
+            <w:tcMar>
+              <w:top w:w="80" w:type="dxa"/>
+              <w:bottom w:w="80" w:type="dxa"/>
+              <w:left w:w="120" w:type="dxa"/>
+              <w:right w:w="120" w:type="dxa"/>
+            </w:tcMar>
+            <w:vAlign w:val="center"/>
+          </w:tcPr>
+          <w:p>
+            <w:pPr>
+              <w:spacing w:after="0"/>
+            </w:pPr>
+            <w:r>
+              <w:rPr>
+                <w:color w:val="282C34"/>
+                <w:sz w:val="18"/>
+              </w:rPr>
+              <w:t>TE Connectivity / KEMET</w:t>
+            </w:r>
+          </w:p>
+        </w:tc>
+        <w:tc>
+          <w:tcPr>
+            <w:tcW w:type="dxa" w:w="1958"/>
+            <w:shd w:fill="F4F7F9"/>
+            <w:tcMar>
+              <w:top w:w="80" w:type="dxa"/>
+              <w:bottom w:w="80" w:type="dxa"/>
+              <w:left w:w="120" w:type="dxa"/>
+              <w:right w:w="120" w:type="dxa"/>
+            </w:tcMar>
+            <w:vAlign w:val="center"/>
+          </w:tcPr>
+          <w:p>
+            <w:pPr>
+              <w:spacing w:after="0"/>
+            </w:pPr>
+            <w:r>
+              <w:rPr>
+                <w:i/>
+                <w:color w:val="145AA0"/>
+                <w:sz w:val="18"/>
+              </w:rPr>
+              <w:t>R = 47\,\Omega / 5\,W Wirewound, C = 0.1\,µF / 630\,V Polypropylene</w:t>
+            </w:r>
+          </w:p>
+        </w:tc>
+        <w:tc>
+          <w:tcPr>
+            <w:tcW w:type="dxa" w:w="1958"/>
+            <w:shd w:fill="F4F7F9"/>
+            <w:tcMar>
+              <w:top w:w="80" w:type="dxa"/>
+              <w:bottom w:w="80" w:type="dxa"/>
+              <w:left w:w="120" w:type="dxa"/>
+              <w:right w:w="120" w:type="dxa"/>
+            </w:tcMar>
+            <w:vAlign w:val="center"/>
+          </w:tcPr>
+          <w:p>
+            <w:pPr>
+              <w:spacing w:after="0"/>
+            </w:pPr>
+            <w:r>
+              <w:rPr>
+                <w:color w:val="282C34"/>
+                <w:sz w:val="18"/>
+              </w:rPr>
+              <w:t>Essential for inductive loads (</w:t>
+            </w:r>
+            <w:r>
+              <w:rPr>
+                <w:i/>
+                <w:color w:val="145AA0"/>
+                <w:sz w:val="18"/>
+              </w:rPr>
+              <w:t>\cos \phi &lt; 1</w:t>
+            </w:r>
+            <w:r>
+              <w:rPr>
+                <w:color w:val="282C34"/>
+                <w:sz w:val="18"/>
+              </w:rPr>
+              <w:t xml:space="preserve">); limits </w:t>
+            </w:r>
+            <w:r>
+              <w:rPr>
+                <w:i/>
+                <w:color w:val="145AA0"/>
+                <w:sz w:val="18"/>
+              </w:rPr>
+              <w:t>\frac{dv{dt &lt; 200\,V/µs</w:t>
+            </w:r>
+            <w:r>
+              <w:rPr>
+                <w:color w:val="282C34"/>
+                <w:sz w:val="18"/>
+              </w:rPr>
+              <w:t xml:space="preserve"> at current zero-crossing.</w:t>
+            </w:r>
+          </w:p>
+        </w:tc>
+      </w:tr>
+      <w:tr>
+        <w:tc>
+          <w:tcPr>
+            <w:tcW w:type="dxa" w:w="1958"/>
+            <w:tcMar>
+              <w:top w:w="80" w:type="dxa"/>
+              <w:bottom w:w="80" w:type="dxa"/>
+              <w:left w:w="120" w:type="dxa"/>
+              <w:right w:w="120" w:type="dxa"/>
+            </w:tcMar>
+            <w:vAlign w:val="center"/>
+          </w:tcPr>
+          <w:p>
+            <w:pPr>
+              <w:spacing w:after="0"/>
+            </w:pPr>
+            <w:r>
+              <w:rPr>
+                <w:b/>
+                <w:color w:val="282C34"/>
+                <w:sz w:val="18"/>
+              </w:rPr>
+              <w:t>$U_1$ (Opto)</w:t>
+            </w:r>
+          </w:p>
+        </w:tc>
+        <w:tc>
+          <w:tcPr>
+            <w:tcW w:type="dxa" w:w="1958"/>
+            <w:tcMar>
+              <w:top w:w="80" w:type="dxa"/>
+              <w:bottom w:w="80" w:type="dxa"/>
+              <w:left w:w="120" w:type="dxa"/>
+              <w:right w:w="120" w:type="dxa"/>
+            </w:tcMar>
+            <w:vAlign w:val="center"/>
+          </w:tcPr>
+          <w:p>
+            <w:pPr>
+              <w:spacing w:after="0"/>
+            </w:pPr>
+            <w:r>
+              <w:rPr>
+                <w:color w:val="282C34"/>
+                <w:sz w:val="18"/>
+              </w:rPr>
+              <w:t>Random-Phase Optoisolator</w:t>
+            </w:r>
+          </w:p>
+        </w:tc>
+        <w:tc>
+          <w:tcPr>
+            <w:tcW w:type="dxa" w:w="1958"/>
+            <w:tcMar>
+              <w:top w:w="80" w:type="dxa"/>
+              <w:bottom w:w="80" w:type="dxa"/>
+              <w:left w:w="120" w:type="dxa"/>
+              <w:right w:w="120" w:type="dxa"/>
+            </w:tcMar>
+            <w:vAlign w:val="center"/>
+          </w:tcPr>
+          <w:p>
+            <w:pPr>
+              <w:spacing w:after="0"/>
+            </w:pPr>
+            <w:r>
+              <w:rPr>
+                <w:color w:val="282C34"/>
+                <w:sz w:val="18"/>
+              </w:rPr>
+              <w:t>ON Semiconductor MOC3052M</w:t>
+            </w:r>
+          </w:p>
+        </w:tc>
+        <w:tc>
+          <w:tcPr>
+            <w:tcW w:type="dxa" w:w="1958"/>
+            <w:tcMar>
+              <w:top w:w="80" w:type="dxa"/>
+              <w:bottom w:w="80" w:type="dxa"/>
+              <w:left w:w="120" w:type="dxa"/>
+              <w:right w:w="120" w:type="dxa"/>
+            </w:tcMar>
+            <w:vAlign w:val="center"/>
+          </w:tcPr>
+          <w:p>
+            <w:pPr>
+              <w:spacing w:after="0"/>
+            </w:pPr>
+            <w:r>
+              <w:rPr>
+                <w:i/>
+                <w:color w:val="145AA0"/>
+                <w:sz w:val="18"/>
+              </w:rPr>
+              <w:t>V_{DRM = 600\,V, I_{FT = 10\,mA, V_{ISO = 5000\,V_{RMS</w:t>
+            </w:r>
+          </w:p>
+        </w:tc>
+        <w:tc>
+          <w:tcPr>
+            <w:tcW w:type="dxa" w:w="1958"/>
+            <w:tcMar>
+              <w:top w:w="80" w:type="dxa"/>
+              <w:bottom w:w="80" w:type="dxa"/>
+              <w:left w:w="120" w:type="dxa"/>
+              <w:right w:w="120" w:type="dxa"/>
+            </w:tcMar>
+            <w:vAlign w:val="center"/>
+          </w:tcPr>
+          <w:p>
+            <w:pPr>
+              <w:spacing w:after="0"/>
+            </w:pPr>
+            <w:r>
+              <w:rPr>
+                <w:color w:val="282C34"/>
+                <w:sz w:val="18"/>
+              </w:rPr>
+              <w:t xml:space="preserve">Non-zero-crossing bilateral triac driver allows arbitrary firing angles </w:t>
+            </w:r>
+            <w:r>
+              <w:rPr>
+                <w:i/>
+                <w:color w:val="145AA0"/>
+                <w:sz w:val="18"/>
+              </w:rPr>
+              <w:t>\alpha \in [0^\circ, 180^\circ]</w:t>
+            </w:r>
+            <w:r>
+              <w:rPr>
+                <w:color w:val="282C34"/>
+                <w:sz w:val="18"/>
+              </w:rPr>
+              <w:t>.</w:t>
+            </w:r>
+          </w:p>
+        </w:tc>
+      </w:tr>
+      <w:tr>
+        <w:tc>
+          <w:tcPr>
+            <w:tcW w:type="dxa" w:w="1958"/>
+            <w:shd w:fill="F4F7F9"/>
+            <w:tcMar>
+              <w:top w:w="80" w:type="dxa"/>
+              <w:bottom w:w="80" w:type="dxa"/>
+              <w:left w:w="120" w:type="dxa"/>
+              <w:right w:w="120" w:type="dxa"/>
+            </w:tcMar>
+            <w:vAlign w:val="center"/>
+          </w:tcPr>
+          <w:p>
+            <w:pPr>
+              <w:spacing w:after="0"/>
+            </w:pPr>
+            <w:r>
+              <w:rPr>
+                <w:b/>
+                <w:color w:val="282C34"/>
+                <w:sz w:val="18"/>
+              </w:rPr>
+              <w:t>$MOV_1$</w:t>
+            </w:r>
+          </w:p>
+        </w:tc>
+        <w:tc>
+          <w:tcPr>
+            <w:tcW w:type="dxa" w:w="1958"/>
+            <w:shd w:fill="F4F7F9"/>
+            <w:tcMar>
+              <w:top w:w="80" w:type="dxa"/>
+              <w:bottom w:w="80" w:type="dxa"/>
+              <w:left w:w="120" w:type="dxa"/>
+              <w:right w:w="120" w:type="dxa"/>
+            </w:tcMar>
+            <w:vAlign w:val="center"/>
+          </w:tcPr>
+          <w:p>
+            <w:pPr>
+              <w:spacing w:after="0"/>
+            </w:pPr>
+            <w:r>
+              <w:rPr>
+                <w:color w:val="282C34"/>
+                <w:sz w:val="18"/>
+              </w:rPr>
+              <w:t>Line Surge Varistor</w:t>
+            </w:r>
+          </w:p>
+        </w:tc>
+        <w:tc>
+          <w:tcPr>
+            <w:tcW w:type="dxa" w:w="1958"/>
+            <w:shd w:fill="F4F7F9"/>
+            <w:tcMar>
+              <w:top w:w="80" w:type="dxa"/>
+              <w:bottom w:w="80" w:type="dxa"/>
+              <w:left w:w="120" w:type="dxa"/>
+              <w:right w:w="120" w:type="dxa"/>
+            </w:tcMar>
+            <w:vAlign w:val="center"/>
+          </w:tcPr>
+          <w:p>
+            <w:pPr>
+              <w:spacing w:after="0"/>
+            </w:pPr>
+            <w:r>
+              <w:rPr>
+                <w:color w:val="282C34"/>
+                <w:sz w:val="18"/>
+              </w:rPr>
+              <w:t>Littelfuse V275LA20CP</w:t>
+            </w:r>
+          </w:p>
+        </w:tc>
+        <w:tc>
+          <w:tcPr>
+            <w:tcW w:type="dxa" w:w="1958"/>
+            <w:shd w:fill="F4F7F9"/>
+            <w:tcMar>
+              <w:top w:w="80" w:type="dxa"/>
+              <w:bottom w:w="80" w:type="dxa"/>
+              <w:left w:w="120" w:type="dxa"/>
+              <w:right w:w="120" w:type="dxa"/>
+            </w:tcMar>
+            <w:vAlign w:val="center"/>
+          </w:tcPr>
+          <w:p>
+            <w:pPr>
+              <w:spacing w:after="0"/>
+            </w:pPr>
+            <w:r>
+              <w:rPr>
+                <w:i/>
+                <w:color w:val="145AA0"/>
+                <w:sz w:val="18"/>
+              </w:rPr>
+              <w:t>V_{RMS = 275\,V, I_{max = 6500\,A, W_{max = 120\,J</w:t>
+            </w:r>
+          </w:p>
+        </w:tc>
+        <w:tc>
+          <w:tcPr>
+            <w:tcW w:type="dxa" w:w="1958"/>
+            <w:shd w:fill="F4F7F9"/>
+            <w:tcMar>
+              <w:top w:w="80" w:type="dxa"/>
+              <w:bottom w:w="80" w:type="dxa"/>
+              <w:left w:w="120" w:type="dxa"/>
+              <w:right w:w="120" w:type="dxa"/>
+            </w:tcMar>
+            <w:vAlign w:val="center"/>
+          </w:tcPr>
+          <w:p>
+            <w:pPr>
+              <w:spacing w:after="0"/>
+            </w:pPr>
+            <w:r>
+              <w:rPr>
+                <w:color w:val="282C34"/>
+                <w:sz w:val="18"/>
+              </w:rPr>
+              <w:t>Protects thyristors and optotriac driver against lightning and grid switching transients.</w:t>
             </w:r>
           </w:p>
         </w:tc>

</xml_diff>